<commit_message>
Fix task 2 submission details
</commit_message>
<xml_diff>
--- a/documents/FUTURE_PE_02_submission_report.docx
+++ b/documents/FUTURE_PE_02_submission_report.docx
@@ -93,7 +93,7 @@
         <w:pStyle w:val="ListBullet"/>
       </w:pPr>
       <w:r>
-        <w:t>ChatGPT / Claude / Gemini style prompt workflow - prompt generation and output refinement.</w:t>
+        <w:t>Claude AI (claude.ai) - prompt generation, UGC ad scripting, and output refinement.</w:t>
       </w:r>
     </w:p>
     <w:p>
@@ -130,12 +130,17 @@
     </w:p>
     <w:p>
       <w:r>
+        <w:t>CIN ID: FIT/MAY26/PE2660</w:t>
+      </w:r>
+    </w:p>
+    <w:p>
+      <w:r>
         <w:t>Repository Name: FUTURE_PE_02</w:t>
       </w:r>
     </w:p>
     <w:p>
       <w:r>
-        <w:t>Website / Demo Link: demo/index.html</w:t>
+        <w:t>Live Website / Demo Link: https://anagha-t-r.github.io/FUTURE_PE_02/</w:t>
       </w:r>
     </w:p>
     <w:p>
@@ -1415,12 +1420,17 @@
     </w:p>
     <w:p>
       <w:r>
+        <w:t>| CIN ID | FIT/MAY26/PE2660 |</w:t>
+      </w:r>
+    </w:p>
+    <w:p>
+      <w:r>
         <w:t>| Product | GlowNest Barrier Repair Gel Cream |</w:t>
       </w:r>
     </w:p>
     <w:p>
       <w:r>
-        <w:t>| Tools Used | ChatGPT / Claude / Gemini style prompts, Markdown, DOCX, GitHub |</w:t>
+        <w:t>| Tools Used | Claude AI (claude.ai), Markdown, DOCX, GitHub |</w:t>
       </w:r>
     </w:p>
     <w:p>
@@ -1441,18 +1451,16 @@
         <w:pStyle w:val="Heading2"/>
       </w:pPr>
       <w:r>
-        <w:t>Website / Demo Link</w:t>
+        <w:t>Live Website / Demo Link</w:t>
       </w:r>
     </w:p>
     <w:p>
       <w:r>
-        <w:t>[Open the project demo](demo/index.html)</w:t>
+        <w:t>[Open the live project demo](https://anagha-t-r.github.io/FUTURE_PE_02/)</w:t>
       </w:r>
     </w:p>
     <w:p>
-      <w:r>
-        <w:t>Replace this local demo link with a GitHub Pages, live website, or video demo link after deployment.</w:t>
-      </w:r>
+      <w:r/>
     </w:p>
     <w:p>
       <w:pPr>

</xml_diff>